<commit_message>
Missade att skriva mitt namn i filen
</commit_message>
<xml_diff>
--- a/Individuell skriftlig inlämningsuppgift.docx
+++ b/Individuell skriftlig inlämningsuppgift.docx
@@ -39,7 +39,7 @@
           <w:sz w:val="32"/>
           <w:shd w:fill="auto" w:val="clear"/>
         </w:rPr>
-        <w:t xml:space="preserve">–</w:t>
+        <w:t xml:space="preserve">– Analysera en teknisk l</w:t>
       </w:r>
       <w:r>
         <w:rPr>
@@ -51,7 +51,7 @@
           <w:sz w:val="32"/>
           <w:shd w:fill="auto" w:val="clear"/>
         </w:rPr>
-        <w:t xml:space="preserve"> Analysera en teknisk lösning</w:t>
+        <w:t xml:space="preserve">ösning</w:t>
       </w:r>
     </w:p>
     <w:p>
@@ -474,7 +474,19 @@
           <w:sz w:val="24"/>
           <w:shd w:fill="auto" w:val="clear"/>
         </w:rPr>
-        <w:t xml:space="preserve">– Split the notan </w:t>
+        <w:t xml:space="preserve">–</w:t>
+      </w:r>
+      <w:r>
+        <w:rPr>
+          <w:rFonts w:ascii="Calibri" w:hAnsi="Calibri" w:cs="Calibri" w:eastAsia="Calibri"/>
+          <w:b/>
+          <w:color w:val="auto"/>
+          <w:spacing w:val="0"/>
+          <w:position w:val="0"/>
+          <w:sz w:val="24"/>
+          <w:shd w:fill="auto" w:val="clear"/>
+        </w:rPr>
+        <w:t xml:space="preserve"> Split the notan </w:t>
       </w:r>
     </w:p>
     <w:p>
@@ -558,7 +570,19 @@
           <w:sz w:val="24"/>
           <w:shd w:fill="auto" w:val="clear"/>
         </w:rPr>
-        <w:t xml:space="preserve">– Bibliotekssystem</w:t>
+        <w:t xml:space="preserve">–</w:t>
+      </w:r>
+      <w:r>
+        <w:rPr>
+          <w:rFonts w:ascii="Calibri" w:hAnsi="Calibri" w:cs="Calibri" w:eastAsia="Calibri"/>
+          <w:b/>
+          <w:color w:val="auto"/>
+          <w:spacing w:val="0"/>
+          <w:position w:val="0"/>
+          <w:sz w:val="24"/>
+          <w:shd w:fill="auto" w:val="clear"/>
+        </w:rPr>
+        <w:t xml:space="preserve"> Bibliotekssystem</w:t>
       </w:r>
     </w:p>
     <w:p>
@@ -791,7 +815,19 @@
           <w:sz w:val="32"/>
           <w:shd w:fill="auto" w:val="clear"/>
         </w:rPr>
-        <w:t xml:space="preserve">– Reflektion</w:t>
+        <w:t xml:space="preserve">–</w:t>
+      </w:r>
+      <w:r>
+        <w:rPr>
+          <w:rFonts w:ascii="Calibri" w:hAnsi="Calibri" w:cs="Calibri" w:eastAsia="Calibri"/>
+          <w:b/>
+          <w:color w:val="auto"/>
+          <w:spacing w:val="0"/>
+          <w:position w:val="0"/>
+          <w:sz w:val="32"/>
+          <w:shd w:fill="auto" w:val="clear"/>
+        </w:rPr>
+        <w:t xml:space="preserve"> Reflektion</w:t>
       </w:r>
     </w:p>
     <w:p>
@@ -994,11 +1030,11 @@
         <w:ind w:right="0" w:left="0" w:firstLine="0"/>
         <w:jc w:val="left"/>
         <w:rPr>
-          <w:rFonts w:ascii="Aptos" w:hAnsi="Aptos" w:cs="Aptos" w:eastAsia="Aptos"/>
-          <w:color w:val="auto"/>
-          <w:spacing w:val="0"/>
-          <w:position w:val="0"/>
-          <w:sz w:val="24"/>
+          <w:rFonts w:ascii="Times New Roman" w:hAnsi="Times New Roman" w:cs="Times New Roman" w:eastAsia="Times New Roman"/>
+          <w:color w:val="auto"/>
+          <w:spacing w:val="0"/>
+          <w:position w:val="0"/>
+          <w:sz w:val="22"/>
           <w:shd w:fill="auto" w:val="clear"/>
         </w:rPr>
       </w:pPr>
@@ -1012,6 +1048,47 @@
           <w:shd w:fill="auto" w:val="clear"/>
         </w:rPr>
         <w:t xml:space="preserve">För att summera det hela så tror jag inte att marknaden kommer ändras överdrivet mycket, utan att fler roller kommer dyka upp. Det kommer fortfarande behövas utvecklare för att fortsätta skapa kod, men även kontrollera det AI har skapat. Utvecklingsprocessen kommer gå snabbare, men även fler restriktioner &amp; lagar som hindrar AI på vissa fronter kommer implementeras.</w:t>
+      </w:r>
+    </w:p>
+    <w:p>
+      <w:pPr>
+        <w:spacing w:before="0" w:after="160" w:line="279"/>
+        <w:ind w:right="0" w:left="0" w:firstLine="0"/>
+        <w:jc w:val="left"/>
+        <w:rPr>
+          <w:rFonts w:ascii="Times New Roman" w:hAnsi="Times New Roman" w:cs="Times New Roman" w:eastAsia="Times New Roman"/>
+          <w:color w:val="auto"/>
+          <w:spacing w:val="0"/>
+          <w:position w:val="0"/>
+          <w:sz w:val="22"/>
+          <w:shd w:fill="auto" w:val="clear"/>
+        </w:rPr>
+      </w:pPr>
+    </w:p>
+    <w:p>
+      <w:pPr>
+        <w:spacing w:before="0" w:after="160" w:line="279"/>
+        <w:ind w:right="0" w:left="0" w:firstLine="0"/>
+        <w:jc w:val="right"/>
+        <w:rPr>
+          <w:rFonts w:ascii="Aptos" w:hAnsi="Aptos" w:cs="Aptos" w:eastAsia="Aptos"/>
+          <w:color w:val="auto"/>
+          <w:spacing w:val="0"/>
+          <w:position w:val="0"/>
+          <w:sz w:val="24"/>
+          <w:shd w:fill="auto" w:val="clear"/>
+        </w:rPr>
+      </w:pPr>
+      <w:r>
+        <w:rPr>
+          <w:rFonts w:ascii="Times New Roman" w:hAnsi="Times New Roman" w:cs="Times New Roman" w:eastAsia="Times New Roman"/>
+          <w:color w:val="auto"/>
+          <w:spacing w:val="0"/>
+          <w:position w:val="0"/>
+          <w:sz w:val="22"/>
+          <w:shd w:fill="auto" w:val="clear"/>
+        </w:rPr>
+        <w:t xml:space="preserve">Christoffer Feldt, 2026-09-10</w:t>
       </w:r>
     </w:p>
   </w:body>

</xml_diff>